<commit_message>
project over view correction
</commit_message>
<xml_diff>
--- a/Docs/k-13 Gear E-commerce Database systemz.docx
+++ b/Docs/k-13 Gear E-commerce Database systemz.docx
@@ -16,41 +16,43 @@
         <w:spacing w:lineRule="auto" w:line="240" w:before="82" w:after="0"/>
         <w:ind w:hanging="288" w:left="288" w:right="0"/>
         <w:jc w:val="left"/>
-        <w:rPr/>
+        <w:rPr>
+          <w:color w:val="000000"/>
+        </w:rPr>
       </w:pPr>
       <w:bookmarkStart w:id="0" w:name="1._Project_Idea_Definition"/>
       <w:bookmarkEnd w:id="0"/>
       <w:r>
         <w:rPr>
-          <w:color w:val="0E4660"/>
+          <w:color w:val="000000"/>
           <w:spacing w:val="-6"/>
         </w:rPr>
         <w:t>Project</w:t>
       </w:r>
       <w:r>
         <w:rPr>
-          <w:color w:val="0E4660"/>
+          <w:color w:val="000000"/>
           <w:spacing w:val="-19"/>
         </w:rPr>
         <w:t xml:space="preserve"> </w:t>
       </w:r>
       <w:r>
         <w:rPr>
-          <w:color w:val="0E4660"/>
+          <w:color w:val="000000"/>
           <w:spacing w:val="-6"/>
         </w:rPr>
         <w:t>Idea</w:t>
       </w:r>
       <w:r>
         <w:rPr>
-          <w:color w:val="0E4660"/>
+          <w:color w:val="000000"/>
           <w:spacing w:val="-19"/>
         </w:rPr>
         <w:t xml:space="preserve"> </w:t>
       </w:r>
       <w:r>
         <w:rPr>
-          <w:color w:val="0E4660"/>
+          <w:color w:val="000000"/>
           <w:spacing w:val="-6"/>
         </w:rPr>
         <w:t>Definition</w:t>
@@ -256,22 +258,27 @@
     <w:p>
       <w:pPr>
         <w:pStyle w:val="Heading2"/>
-        <w:rPr/>
+        <w:rPr>
+          <w:color w:val="000000"/>
+        </w:rPr>
       </w:pPr>
       <w:r>
         <w:rPr>
+          <w:color w:val="000000"/>
           <w:spacing w:val="-2"/>
         </w:rPr>
         <w:t>Problem</w:t>
       </w:r>
       <w:r>
         <w:rPr>
+          <w:color w:val="000000"/>
           <w:spacing w:val="-20"/>
         </w:rPr>
         <w:t xml:space="preserve"> </w:t>
       </w:r>
       <w:r>
         <w:rPr>
+          <w:color w:val="000000"/>
           <w:spacing w:val="-2"/>
         </w:rPr>
         <w:t>Statement:</w:t>
@@ -1462,24 +1469,39 @@
     <w:p>
       <w:pPr>
         <w:pStyle w:val="Heading2"/>
-        <w:rPr/>
+        <w:rPr>
+          <w:color w:val="000000"/>
+        </w:rPr>
       </w:pPr>
       <w:r>
-        <w:rPr/>
+        <w:rPr>
+          <w:color w:val="000000"/>
+        </w:rPr>
         <w:t>Context</w:t>
       </w:r>
       <w:r>
         <w:rPr>
+          <w:color w:val="000000"/>
           <w:spacing w:val="-11"/>
         </w:rPr>
         <w:t xml:space="preserve"> </w:t>
       </w:r>
       <w:r>
-        <w:rPr/>
-        <w:t xml:space="preserve">s </w:t>
-      </w:r>
-      <w:r>
-        <w:rPr>
+        <w:rPr>
+          <w:color w:val="000000"/>
+          <w:spacing w:val="-11"/>
+        </w:rPr>
+        <w:t>and</w:t>
+      </w:r>
+      <w:r>
+        <w:rPr>
+          <w:color w:val="000000"/>
+        </w:rPr>
+        <w:t xml:space="preserve"> </w:t>
+      </w:r>
+      <w:r>
+        <w:rPr>
+          <w:color w:val="000000"/>
           <w:spacing w:val="-2"/>
         </w:rPr>
         <w:t>Solution:</w:t>

</xml_diff>

<commit_message>
project over view second correction
</commit_message>
<xml_diff>
--- a/Docs/k-13 Gear E-commerce Database systemz.docx
+++ b/Docs/k-13 Gear E-commerce Database systemz.docx
@@ -17,42 +17,42 @@
         <w:ind w:hanging="288" w:left="288" w:right="0"/>
         <w:jc w:val="left"/>
         <w:rPr>
-          <w:color w:val="000000"/>
+          <w:color w:val="1E6A39"/>
         </w:rPr>
       </w:pPr>
       <w:bookmarkStart w:id="0" w:name="1._Project_Idea_Definition"/>
       <w:bookmarkEnd w:id="0"/>
       <w:r>
         <w:rPr>
-          <w:color w:val="000000"/>
+          <w:color w:val="1E6A39"/>
           <w:spacing w:val="-6"/>
         </w:rPr>
         <w:t>Project</w:t>
       </w:r>
       <w:r>
         <w:rPr>
-          <w:color w:val="000000"/>
+          <w:color w:val="1E6A39"/>
           <w:spacing w:val="-19"/>
         </w:rPr>
         <w:t xml:space="preserve"> </w:t>
       </w:r>
       <w:r>
         <w:rPr>
-          <w:color w:val="000000"/>
+          <w:color w:val="1E6A39"/>
           <w:spacing w:val="-6"/>
         </w:rPr>
         <w:t>Idea</w:t>
       </w:r>
       <w:r>
         <w:rPr>
-          <w:color w:val="000000"/>
+          <w:color w:val="1E6A39"/>
           <w:spacing w:val="-19"/>
         </w:rPr>
         <w:t xml:space="preserve"> </w:t>
       </w:r>
       <w:r>
         <w:rPr>
-          <w:color w:val="000000"/>
+          <w:color w:val="1E6A39"/>
           <w:spacing w:val="-6"/>
         </w:rPr>
         <w:t>Definition</w:t>
@@ -259,26 +259,26 @@
       <w:pPr>
         <w:pStyle w:val="Heading2"/>
         <w:rPr>
-          <w:color w:val="000000"/>
+          <w:color w:val="1E6A39"/>
         </w:rPr>
       </w:pPr>
       <w:r>
         <w:rPr>
-          <w:color w:val="000000"/>
+          <w:color w:val="1E6A39"/>
           <w:spacing w:val="-2"/>
         </w:rPr>
         <w:t>Problem</w:t>
       </w:r>
       <w:r>
         <w:rPr>
-          <w:color w:val="000000"/>
+          <w:color w:val="1E6A39"/>
           <w:spacing w:val="-20"/>
         </w:rPr>
         <w:t xml:space="preserve"> </w:t>
       </w:r>
       <w:r>
         <w:rPr>
-          <w:color w:val="000000"/>
+          <w:color w:val="1E6A39"/>
           <w:spacing w:val="-2"/>
         </w:rPr>
         <w:t>Statement:</w:t>
@@ -1470,38 +1470,31 @@
       <w:pPr>
         <w:pStyle w:val="Heading2"/>
         <w:rPr>
-          <w:color w:val="000000"/>
+          <w:color w:val="1E6A39"/>
         </w:rPr>
       </w:pPr>
       <w:r>
         <w:rPr>
-          <w:color w:val="000000"/>
+          <w:color w:val="1E6A39"/>
         </w:rPr>
         <w:t>Context</w:t>
       </w:r>
       <w:r>
         <w:rPr>
-          <w:color w:val="000000"/>
+          <w:color w:val="1E6A39"/>
           <w:spacing w:val="-11"/>
         </w:rPr>
-        <w:t xml:space="preserve"> </w:t>
-      </w:r>
-      <w:r>
-        <w:rPr>
-          <w:color w:val="000000"/>
-          <w:spacing w:val="-11"/>
-        </w:rPr>
-        <w:t>and</w:t>
-      </w:r>
-      <w:r>
-        <w:rPr>
-          <w:color w:val="000000"/>
-        </w:rPr>
-        <w:t xml:space="preserve"> </w:t>
-      </w:r>
-      <w:r>
-        <w:rPr>
-          <w:color w:val="000000"/>
+        <w:t xml:space="preserve"> and</w:t>
+      </w:r>
+      <w:r>
+        <w:rPr>
+          <w:color w:val="1E6A39"/>
+        </w:rPr>
+        <w:t xml:space="preserve"> </w:t>
+      </w:r>
+      <w:r>
+        <w:rPr>
+          <w:color w:val="1E6A39"/>
           <w:spacing w:val="-2"/>
         </w:rPr>
         <w:t>Solution:</w:t>

</xml_diff>